<commit_message>
change according to comments
</commit_message>
<xml_diff>
--- a/Rotator.docx
+++ b/Rotator.docx
@@ -468,7 +468,25 @@
           <w:sz w:val="28"/>
           <w:szCs w:val="28"/>
         </w:rPr>
-        <w:t xml:space="preserve"> “Rotator” </w:t>
+        <w:t xml:space="preserve"> “</w:t>
+      </w:r>
+      <w:r>
+        <w:rPr>
+          <w:rFonts w:ascii="Times New Roman" w:hAnsi="Times New Roman" w:cs="Times New Roman"/>
+          <w:b/>
+          <w:bCs/>
+          <w:sz w:val="28"/>
+          <w:szCs w:val="28"/>
+        </w:rPr>
+        <w:t>Rotator</w:t>
+      </w:r>
+      <w:r>
+        <w:rPr>
+          <w:rFonts w:ascii="Times New Roman" w:hAnsi="Times New Roman" w:cs="Times New Roman"/>
+          <w:sz w:val="28"/>
+          <w:szCs w:val="28"/>
+        </w:rPr>
+        <w:t xml:space="preserve">” </w:t>
       </w:r>
       <w:proofErr w:type="spellStart"/>
       <w:r>
@@ -745,6 +763,8 @@
       <w:r>
         <w:rPr>
           <w:rFonts w:ascii="Times New Roman" w:hAnsi="Times New Roman" w:cs="Times New Roman"/>
+          <w:b/>
+          <w:bCs/>
           <w:i/>
           <w:iCs/>
         </w:rPr>
@@ -780,6 +800,8 @@
       <w:r>
         <w:rPr>
           <w:rFonts w:ascii="Times New Roman" w:hAnsi="Times New Roman" w:cs="Times New Roman"/>
+          <w:b/>
+          <w:bCs/>
           <w:i/>
           <w:iCs/>
         </w:rPr>
@@ -817,7 +839,35 @@
         <w:rPr>
           <w:rFonts w:ascii="Times New Roman" w:hAnsi="Times New Roman" w:cs="Times New Roman"/>
         </w:rPr>
-        <w:t>) перемикач режиму задання координати по азимуту. ABS – по абсолютним значенням та RELL – по відносним значенням. Огляд кожного з режимів буде описано згодом</w:t>
+        <w:t xml:space="preserve">) перемикач режиму задання координати по азимуту. </w:t>
+      </w:r>
+      <w:r>
+        <w:rPr>
+          <w:rFonts w:ascii="Times New Roman" w:hAnsi="Times New Roman" w:cs="Times New Roman"/>
+          <w:b/>
+          <w:bCs/>
+        </w:rPr>
+        <w:t>ABS</w:t>
+      </w:r>
+      <w:r>
+        <w:rPr>
+          <w:rFonts w:ascii="Times New Roman" w:hAnsi="Times New Roman" w:cs="Times New Roman"/>
+        </w:rPr>
+        <w:t xml:space="preserve"> – по абсолютним значенням та </w:t>
+      </w:r>
+      <w:r>
+        <w:rPr>
+          <w:rFonts w:ascii="Times New Roman" w:hAnsi="Times New Roman" w:cs="Times New Roman"/>
+          <w:b/>
+          <w:bCs/>
+        </w:rPr>
+        <w:t>RELL</w:t>
+      </w:r>
+      <w:r>
+        <w:rPr>
+          <w:rFonts w:ascii="Times New Roman" w:hAnsi="Times New Roman" w:cs="Times New Roman"/>
+        </w:rPr>
+        <w:t xml:space="preserve"> – по відносним значенням. Огляд кожного з режимів буде описано згодом</w:t>
       </w:r>
       <w:r>
         <w:rPr>
@@ -843,6 +893,8 @@
       <w:r>
         <w:rPr>
           <w:rFonts w:ascii="Times New Roman" w:hAnsi="Times New Roman" w:cs="Times New Roman"/>
+          <w:b/>
+          <w:bCs/>
           <w:i/>
           <w:iCs/>
         </w:rPr>
@@ -892,6 +944,8 @@
       <w:r>
         <w:rPr>
           <w:rFonts w:ascii="Times New Roman" w:hAnsi="Times New Roman" w:cs="Times New Roman"/>
+          <w:b/>
+          <w:bCs/>
           <w:i/>
           <w:iCs/>
         </w:rPr>
@@ -928,6 +982,8 @@
       <w:r>
         <w:rPr>
           <w:rFonts w:ascii="Times New Roman" w:hAnsi="Times New Roman" w:cs="Times New Roman"/>
+          <w:b/>
+          <w:bCs/>
           <w:i/>
           <w:iCs/>
         </w:rPr>
@@ -985,6 +1041,8 @@
       <w:r>
         <w:rPr>
           <w:rFonts w:ascii="Times New Roman" w:hAnsi="Times New Roman" w:cs="Times New Roman"/>
+          <w:b/>
+          <w:bCs/>
           <w:i/>
           <w:iCs/>
         </w:rPr>
@@ -994,6 +1052,8 @@
       <w:r>
         <w:rPr>
           <w:rFonts w:ascii="Times New Roman" w:hAnsi="Times New Roman" w:cs="Times New Roman"/>
+          <w:b/>
+          <w:bCs/>
           <w:i/>
           <w:iCs/>
         </w:rPr>
@@ -1003,6 +1063,8 @@
       <w:r>
         <w:rPr>
           <w:rFonts w:ascii="Times New Roman" w:hAnsi="Times New Roman" w:cs="Times New Roman"/>
+          <w:b/>
+          <w:bCs/>
           <w:i/>
           <w:iCs/>
         </w:rPr>
@@ -1046,6 +1108,8 @@
       <w:r>
         <w:rPr>
           <w:rFonts w:ascii="Times New Roman" w:hAnsi="Times New Roman" w:cs="Times New Roman"/>
+          <w:b/>
+          <w:bCs/>
           <w:i/>
           <w:iCs/>
         </w:rPr>
@@ -1056,7 +1120,21 @@
         <w:rPr>
           <w:rFonts w:ascii="Times New Roman" w:hAnsi="Times New Roman" w:cs="Times New Roman"/>
         </w:rPr>
-        <w:t xml:space="preserve"> – слугує для встановлення значення абсолютного (або відносного в режимі RELL) азимуту для </w:t>
+        <w:t xml:space="preserve"> – слугує для встановлення значення абсолютного (або відносного в режимі </w:t>
+      </w:r>
+      <w:r>
+        <w:rPr>
+          <w:rFonts w:ascii="Times New Roman" w:hAnsi="Times New Roman" w:cs="Times New Roman"/>
+          <w:b/>
+          <w:bCs/>
+        </w:rPr>
+        <w:t>RELL</w:t>
+      </w:r>
+      <w:r>
+        <w:rPr>
+          <w:rFonts w:ascii="Times New Roman" w:hAnsi="Times New Roman" w:cs="Times New Roman"/>
+        </w:rPr>
+        <w:t xml:space="preserve">) азимуту для </w:t>
       </w:r>
       <w:proofErr w:type="spellStart"/>
       <w:r>
@@ -1111,6 +1189,8 @@
       <w:r>
         <w:rPr>
           <w:rFonts w:ascii="Times New Roman" w:hAnsi="Times New Roman" w:cs="Times New Roman"/>
+          <w:b/>
+          <w:bCs/>
           <w:i/>
           <w:iCs/>
         </w:rPr>
@@ -1149,12 +1229,28 @@
         <w:rPr>
           <w:rFonts w:ascii="Times New Roman" w:hAnsi="Times New Roman" w:cs="Times New Roman"/>
         </w:rPr>
-        <w:t xml:space="preserve"> значення за допомогою стрілок. Зміна режиму задання координат (ABS/RELL) не впливає на значення вертикального кута повороту, іншими слова </w:t>
-      </w:r>
-      <w:proofErr w:type="spellStart"/>
-      <w:r>
-        <w:rPr>
-          <w:rFonts w:ascii="Times New Roman" w:hAnsi="Times New Roman" w:cs="Times New Roman"/>
+        <w:t xml:space="preserve"> значення за допомогою стрілок. Зміна режиму задання координат (</w:t>
+      </w:r>
+      <w:r>
+        <w:rPr>
+          <w:rFonts w:ascii="Times New Roman" w:hAnsi="Times New Roman" w:cs="Times New Roman"/>
+          <w:b/>
+          <w:bCs/>
+        </w:rPr>
+        <w:t>ABS/RELL</w:t>
+      </w:r>
+      <w:r>
+        <w:rPr>
+          <w:rFonts w:ascii="Times New Roman" w:hAnsi="Times New Roman" w:cs="Times New Roman"/>
+        </w:rPr>
+        <w:t xml:space="preserve">) не впливає на значення вертикального кута повороту, іншими слова </w:t>
+      </w:r>
+      <w:proofErr w:type="spellStart"/>
+      <w:r>
+        <w:rPr>
+          <w:rFonts w:ascii="Times New Roman" w:hAnsi="Times New Roman" w:cs="Times New Roman"/>
+          <w:b/>
+          <w:bCs/>
         </w:rPr>
         <w:t>Elevation</w:t>
       </w:r>
@@ -1763,7 +1859,25 @@
           <w:sz w:val="28"/>
           <w:szCs w:val="28"/>
         </w:rPr>
-        <w:t xml:space="preserve"> (ABS) </w:t>
+        <w:t xml:space="preserve"> (</w:t>
+      </w:r>
+      <w:r>
+        <w:rPr>
+          <w:rFonts w:ascii="Times New Roman" w:hAnsi="Times New Roman" w:cs="Times New Roman"/>
+          <w:b/>
+          <w:bCs/>
+          <w:sz w:val="28"/>
+          <w:szCs w:val="28"/>
+        </w:rPr>
+        <w:t>ABS</w:t>
+      </w:r>
+      <w:r>
+        <w:rPr>
+          <w:rFonts w:ascii="Times New Roman" w:hAnsi="Times New Roman" w:cs="Times New Roman"/>
+          <w:sz w:val="28"/>
+          <w:szCs w:val="28"/>
+        </w:rPr>
+        <w:t xml:space="preserve">) </w:t>
       </w:r>
       <w:proofErr w:type="spellStart"/>
       <w:r>
@@ -2617,6 +2731,8 @@
       <w:r>
         <w:rPr>
           <w:rFonts w:ascii="Times New Roman" w:hAnsi="Times New Roman" w:cs="Times New Roman"/>
+          <w:b/>
+          <w:bCs/>
           <w:i/>
           <w:iCs/>
         </w:rPr>
@@ -2632,6 +2748,8 @@
       <w:r>
         <w:rPr>
           <w:rFonts w:ascii="Times New Roman" w:hAnsi="Times New Roman" w:cs="Times New Roman"/>
+          <w:b/>
+          <w:bCs/>
         </w:rPr>
         <w:t>Azimuth</w:t>
       </w:r>
@@ -2665,6 +2783,8 @@
       <w:r>
         <w:rPr>
           <w:rFonts w:ascii="Times New Roman" w:hAnsi="Times New Roman" w:cs="Times New Roman"/>
+          <w:b/>
+          <w:bCs/>
           <w:i/>
           <w:iCs/>
         </w:rPr>
@@ -2700,6 +2820,8 @@
       <w:r>
         <w:rPr>
           <w:rFonts w:ascii="Times New Roman" w:hAnsi="Times New Roman" w:cs="Times New Roman"/>
+          <w:b/>
+          <w:bCs/>
           <w:i/>
           <w:iCs/>
         </w:rPr>
@@ -2859,7 +2981,21 @@
         <w:rPr>
           <w:rFonts w:ascii="Times New Roman" w:hAnsi="Times New Roman" w:cs="Times New Roman"/>
         </w:rPr>
-        <w:t xml:space="preserve"> за яким ви намотаєте кабель на поворотку виглядає так: подали живлення, повернули на 200° скажімо за годинниковою стрілкою, не вимкнули керування повороткою (ON/OFF)</w:t>
+        <w:t xml:space="preserve"> за яким ви намотаєте кабель на поворотку виглядає так: подали живлення, повернули на 200° скажімо за годинниковою стрілкою, не вимкнули керування повороткою (</w:t>
+      </w:r>
+      <w:r>
+        <w:rPr>
+          <w:rFonts w:ascii="Times New Roman" w:hAnsi="Times New Roman" w:cs="Times New Roman"/>
+          <w:b/>
+          <w:bCs/>
+        </w:rPr>
+        <w:t>ON/OFF</w:t>
+      </w:r>
+      <w:r>
+        <w:rPr>
+          <w:rFonts w:ascii="Times New Roman" w:hAnsi="Times New Roman" w:cs="Times New Roman"/>
+        </w:rPr>
+        <w:t>)</w:t>
       </w:r>
       <w:r>
         <w:rPr>

</xml_diff>

<commit_message>
little changes to rotator
</commit_message>
<xml_diff>
--- a/Rotator.docx
+++ b/Rotator.docx
@@ -44,7 +44,7 @@
         <mc:AlternateContent>
           <mc:Choice Requires="wpg">
             <w:drawing>
-              <wp:anchor distT="0" distB="0" distL="114300" distR="114300" simplePos="0" relativeHeight="251660288" behindDoc="0" locked="0" layoutInCell="1" allowOverlap="1" wp14:anchorId="39A7ADEC" wp14:editId="4E35BC74">
+              <wp:anchor distT="0" distB="0" distL="114300" distR="114300" simplePos="0" relativeHeight="251660288" behindDoc="0" locked="0" layoutInCell="1" allowOverlap="1" wp14:anchorId="39A7ADEC" wp14:editId="4F5BEF6F">
                 <wp:simplePos x="0" y="0"/>
                 <wp:positionH relativeFrom="margin">
                   <wp:align>right</wp:align>
@@ -52,8 +52,8 @@
                 <wp:positionV relativeFrom="paragraph">
                   <wp:posOffset>159385</wp:posOffset>
                 </wp:positionV>
-                <wp:extent cx="1344295" cy="2998470"/>
-                <wp:effectExtent l="0" t="0" r="8255" b="0"/>
+                <wp:extent cx="1706245" cy="3744595"/>
+                <wp:effectExtent l="0" t="0" r="8255" b="8255"/>
                 <wp:wrapSquare wrapText="bothSides"/>
                 <wp:docPr id="3" name="Групувати 3"/>
                 <wp:cNvGraphicFramePr/>
@@ -64,15 +64,15 @@
                       <wpg:grpSpPr>
                         <a:xfrm>
                           <a:off x="0" y="0"/>
-                          <a:ext cx="1344295" cy="2998470"/>
-                          <a:chOff x="0" y="0"/>
-                          <a:chExt cx="1344295" cy="2998470"/>
+                          <a:ext cx="1706400" cy="3745037"/>
+                          <a:chOff x="-1" y="0"/>
+                          <a:chExt cx="1706400" cy="3745037"/>
                         </a:xfrm>
                       </wpg:grpSpPr>
                       <pic:pic xmlns:pic="http://schemas.openxmlformats.org/drawingml/2006/picture">
                         <pic:nvPicPr>
                           <pic:cNvPr id="11" name="Picture 1"/>
-                          <pic:cNvPicPr>
+                          <pic:cNvPicPr preferRelativeResize="0">
                             <a:picLocks noChangeAspect="1"/>
                           </pic:cNvPicPr>
                         </pic:nvPicPr>
@@ -90,8 +90,8 @@
                         </pic:blipFill>
                         <pic:spPr>
                           <a:xfrm>
-                            <a:off x="0" y="0"/>
-                            <a:ext cx="1337945" cy="2760345"/>
+                            <a:off x="-1" y="0"/>
+                            <a:ext cx="1706400" cy="3520513"/>
                           </a:xfrm>
                           <a:prstGeom prst="rect">
                             <a:avLst/>
@@ -103,7 +103,7 @@
                         <wps:cNvSpPr txBox="1"/>
                         <wps:spPr>
                           <a:xfrm>
-                            <a:off x="6350" y="2794000"/>
+                            <a:off x="162608" y="3540567"/>
                             <a:ext cx="1337945" cy="204470"/>
                           </a:xfrm>
                           <a:prstGeom prst="rect">
@@ -175,12 +175,18 @@
                     </wpg:wgp>
                   </a:graphicData>
                 </a:graphic>
+                <wp14:sizeRelH relativeFrom="margin">
+                  <wp14:pctWidth>0</wp14:pctWidth>
+                </wp14:sizeRelH>
+                <wp14:sizeRelV relativeFrom="margin">
+                  <wp14:pctHeight>0</wp14:pctHeight>
+                </wp14:sizeRelV>
               </wp:anchor>
             </w:drawing>
           </mc:Choice>
           <mc:Fallback>
             <w:pict>
-              <v:group w14:anchorId="39A7ADEC" id="Групувати 3" o:spid="_x0000_s1026" style="position:absolute;left:0;text-align:left;margin-left:54.65pt;margin-top:12.55pt;width:105.85pt;height:236.1pt;z-index:251660288;mso-position-horizontal:right;mso-position-horizontal-relative:margin" coordsize="13442,29984" o:gfxdata="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">
+              <v:group w14:anchorId="39A7ADEC" id="Групувати 3" o:spid="_x0000_s1026" style="position:absolute;left:0;text-align:left;margin-left:83.15pt;margin-top:12.55pt;width:134.35pt;height:294.85pt;z-index:251660288;mso-position-horizontal:right;mso-position-horizontal-relative:margin;mso-width-relative:margin;mso-height-relative:margin" coordorigin="" coordsize="17064,37450" o:gfxdata="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">
                 <v:shapetype id="_x0000_t75" coordsize="21600,21600" o:spt="75" o:preferrelative="t" path="m@4@5l@4@11@9@11@9@5xe" filled="f" stroked="f">
                   <v:stroke joinstyle="miter"/>
                   <v:formulas>
@@ -200,14 +206,14 @@
                   <v:path o:extrusionok="f" gradientshapeok="t" o:connecttype="rect"/>
                   <o:lock v:ext="edit" aspectratio="t"/>
                 </v:shapetype>
-                <v:shape id="Picture 1" o:spid="_x0000_s1027" type="#_x0000_t75" style="position:absolute;width:13379;height:27603;visibility:visible;mso-wrap-style:square" o:gfxdata="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">
+                <v:shape id="Picture 1" o:spid="_x0000_s1027" type="#_x0000_t75" style="position:absolute;width:17063;height:35205;visibility:visible;mso-wrap-style:square" o:preferrelative="f" o:gfxdata="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">
                   <v:imagedata r:id="rId6" o:title=""/>
                 </v:shape>
                 <v:shapetype id="_x0000_t202" coordsize="21600,21600" o:spt="202" path="m,l,21600r21600,l21600,xe">
                   <v:stroke joinstyle="miter"/>
                   <v:path gradientshapeok="t" o:connecttype="rect"/>
                 </v:shapetype>
-                <v:shape id="Поле 12" o:spid="_x0000_s1028" type="#_x0000_t202" style="position:absolute;left:63;top:27940;width:13379;height:2044;visibility:visible;mso-wrap-style:square;v-text-anchor:top" o:gfxdata="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" stroked="f">
+                <v:shape id="Поле 12" o:spid="_x0000_s1028" type="#_x0000_t202" style="position:absolute;left:1626;top:35405;width:13379;height:2045;visibility:visible;mso-wrap-style:square;v-text-anchor:top" o:gfxdata="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" stroked="f">
                   <v:textbox style="mso-fit-shape-to-text:t" inset="0,0,0,0">
                     <w:txbxContent>
                       <w:p>
@@ -2483,7 +2489,7 @@
         <mc:AlternateContent>
           <mc:Choice Requires="wpg">
             <w:drawing>
-              <wp:anchor distT="0" distB="0" distL="114300" distR="114300" simplePos="0" relativeHeight="251662336" behindDoc="0" locked="0" layoutInCell="1" allowOverlap="1" wp14:anchorId="6387380E" wp14:editId="6F17A0EB">
+              <wp:anchor distT="0" distB="0" distL="114300" distR="114300" simplePos="0" relativeHeight="251662336" behindDoc="0" locked="0" layoutInCell="1" allowOverlap="1" wp14:anchorId="6387380E" wp14:editId="315E19B3">
                 <wp:simplePos x="0" y="0"/>
                 <wp:positionH relativeFrom="margin">
                   <wp:align>right</wp:align>
@@ -2491,8 +2497,8 @@
                 <wp:positionV relativeFrom="paragraph">
                   <wp:posOffset>187325</wp:posOffset>
                 </wp:positionV>
-                <wp:extent cx="1518285" cy="3373120"/>
-                <wp:effectExtent l="0" t="0" r="5715" b="0"/>
+                <wp:extent cx="1706245" cy="3743325"/>
+                <wp:effectExtent l="0" t="0" r="8255" b="9525"/>
                 <wp:wrapSquare wrapText="bothSides"/>
                 <wp:docPr id="4" name="Групувати 4"/>
                 <wp:cNvGraphicFramePr/>
@@ -2503,15 +2509,15 @@
                       <wpg:grpSpPr>
                         <a:xfrm>
                           <a:off x="0" y="0"/>
-                          <a:ext cx="1518285" cy="3373120"/>
-                          <a:chOff x="0" y="0"/>
-                          <a:chExt cx="1518285" cy="3373120"/>
+                          <a:ext cx="1706400" cy="3743510"/>
+                          <a:chOff x="-1" y="0"/>
+                          <a:chExt cx="1706400" cy="3743510"/>
                         </a:xfrm>
                       </wpg:grpSpPr>
                       <pic:pic xmlns:pic="http://schemas.openxmlformats.org/drawingml/2006/picture">
                         <pic:nvPicPr>
                           <pic:cNvPr id="9" name="Picture 2"/>
-                          <pic:cNvPicPr>
+                          <pic:cNvPicPr preferRelativeResize="0">
                             <a:picLocks noChangeAspect="1"/>
                           </pic:cNvPicPr>
                         </pic:nvPicPr>
@@ -2529,8 +2535,8 @@
                         </pic:blipFill>
                         <pic:spPr>
                           <a:xfrm>
-                            <a:off x="0" y="0"/>
-                            <a:ext cx="1518285" cy="3124200"/>
+                            <a:off x="-1" y="0"/>
+                            <a:ext cx="1706400" cy="3511287"/>
                           </a:xfrm>
                           <a:prstGeom prst="rect">
                             <a:avLst/>
@@ -2542,7 +2548,7 @@
                         <wps:cNvSpPr txBox="1"/>
                         <wps:spPr>
                           <a:xfrm>
-                            <a:off x="0" y="3168650"/>
+                            <a:off x="115747" y="3539040"/>
                             <a:ext cx="1518285" cy="204470"/>
                           </a:xfrm>
                           <a:prstGeom prst="rect">
@@ -2614,16 +2620,22 @@
                     </wpg:wgp>
                   </a:graphicData>
                 </a:graphic>
+                <wp14:sizeRelH relativeFrom="margin">
+                  <wp14:pctWidth>0</wp14:pctWidth>
+                </wp14:sizeRelH>
+                <wp14:sizeRelV relativeFrom="margin">
+                  <wp14:pctHeight>0</wp14:pctHeight>
+                </wp14:sizeRelV>
               </wp:anchor>
             </w:drawing>
           </mc:Choice>
           <mc:Fallback>
             <w:pict>
-              <v:group w14:anchorId="6387380E" id="Групувати 4" o:spid="_x0000_s1029" style="position:absolute;left:0;text-align:left;margin-left:68.35pt;margin-top:14.75pt;width:119.55pt;height:265.6pt;z-index:251662336;mso-position-horizontal:right;mso-position-horizontal-relative:margin" coordsize="15182,33731" o:gfxdata="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">
-                <v:shape id="Picture 2" o:spid="_x0000_s1030" type="#_x0000_t75" style="position:absolute;width:15182;height:31242;visibility:visible;mso-wrap-style:square" o:gfxdata="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">
+              <v:group w14:anchorId="6387380E" id="Групувати 4" o:spid="_x0000_s1029" style="position:absolute;left:0;text-align:left;margin-left:83.15pt;margin-top:14.75pt;width:134.35pt;height:294.75pt;z-index:251662336;mso-position-horizontal:right;mso-position-horizontal-relative:margin;mso-width-relative:margin;mso-height-relative:margin" coordorigin="" coordsize="17064,37435" o:gfxdata="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">
+                <v:shape id="Picture 2" o:spid="_x0000_s1030" type="#_x0000_t75" style="position:absolute;width:17063;height:35112;visibility:visible;mso-wrap-style:square" o:preferrelative="f" o:gfxdata="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">
                   <v:imagedata r:id="rId8" o:title=""/>
                 </v:shape>
-                <v:shape id="Поле 13" o:spid="_x0000_s1031" type="#_x0000_t202" style="position:absolute;top:31686;width:15182;height:2045;visibility:visible;mso-wrap-style:square;v-text-anchor:top" o:gfxdata="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" stroked="f">
+                <v:shape id="Поле 13" o:spid="_x0000_s1031" type="#_x0000_t202" style="position:absolute;left:1157;top:35390;width:15183;height:2045;visibility:visible;mso-wrap-style:square;v-text-anchor:top" o:gfxdata="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" stroked="f">
                   <v:textbox style="mso-fit-shape-to-text:t" inset="0,0,0,0">
                     <w:txbxContent>
                       <w:p>

</xml_diff>